<commit_message>
procurações: fix SDTs e município em todos os templates
Aplica as mesmas correções da procuracao_sigma para os 4 templates restantes:

procuracao_poderes_especificos_sigma:
- Remove 11 SDTs labels (razão social, CNPJ, PODERES, VIGENCIA, etc.)
- Substitui SDT Município/UF → {{MUNICIPIO_UF}}
- Corrige run da assinatura: Goiânia → {{MUNICIPIO_UF}}, {{DATA_EXTENSO}}

procuracao_para_servicos_externos_terceirizado:
- Sem SDTs; substitui run hardcoded "Goiânia" → {{MUNICIPIO_UF}}

substabelecimento_com_reserva_sigma:
- Remove 8 SDTs labels (Nome Completo, CPF, RG, empresa, CNPJ, PODERES, VIGENCIA, data)
- Goiânia permanece hardcoded (Bruno assina em Goiânia)

substabelecimento_sem_reserva_sigma:
- Remove 9 SDTs labels + SDT Município/UF (sem substituir)
- Goiânia permanece hardcoded

Co-Authored-By: Claude Sonnet 4.6 <noreply@anthropic.com>
</commit_message>
<xml_diff>
--- a/static/modelos_procuracao/procuracao_poderes_especificos_sigma.docx
+++ b/static/modelos_procuracao/procuracao_poderes_especificos_sigma.docx
@@ -129,39 +129,6 @@
         </w:rPr>
         <w:t xml:space="preserve"> {{RAZAO_SOCIAL}}</w:t>
       </w:r>
-      <w:sdt>
-        <w:sdtPr>
-          <w:rPr>
-            <w:rFonts w:ascii="Times New Roman" w:hAnsi="Times New Roman" w:cs="Times New Roman"/>
-          </w:rPr>
-          <w:id w:val="-438221837"/>
-          <w:placeholder>
-            <w:docPart w:val="E28D0B598C81432FA076E1F3D340C255"/>
-          </w:placeholder>
-          <w:temporary/>
-          <w:showingPlcHdr/>
-          <w:text/>
-        </w:sdtPr>
-        <w:sdtEndPr>
-          <w:rPr>
-            <w:rFonts w:eastAsia="Times New Roman"/>
-            <w:b/>
-            <w:bCs/>
-            <w:color w:val="000000" w:themeColor="text1"/>
-            <w:shd w:val="clear" w:color="auto" w:fill="FFFFFF"/>
-          </w:rPr>
-        </w:sdtEndPr>
-        <w:sdtContent>
-          <w:r>
-            <w:rPr>
-              <w:rStyle w:val="TextodoEspaoReservado"/>
-              <w:rFonts w:ascii="Times New Roman" w:hAnsi="Times New Roman" w:cs="Times New Roman"/>
-              <w:color w:val="C00000"/>
-            </w:rPr>
-            <w:t>razão social da empresa</w:t>
-          </w:r>
-        </w:sdtContent>
-      </w:sdt>
       <w:r>
         <w:rPr>
           <w:rFonts w:ascii="Times New Roman" w:eastAsia="Times New Roman" w:hAnsi="Times New Roman" w:cs="Times New Roman"/>
@@ -180,33 +147,6 @@
         </w:rPr>
         <w:t xml:space="preserve"> estabelecida no endereço {{ENDERECO}}</w:t>
       </w:r>
-      <w:sdt>
-        <w:sdtPr>
-          <w:rPr>
-            <w:rFonts w:ascii="Times New Roman" w:eastAsia="Times New Roman" w:hAnsi="Times New Roman" w:cs="Times New Roman"/>
-            <w:color w:val="000000" w:themeColor="text1"/>
-            <w:kern w:val="36"/>
-            <w:lang w:eastAsia="pt-BR"/>
-          </w:rPr>
-          <w:id w:val="1700282332"/>
-          <w:placeholder>
-            <w:docPart w:val="67876CCA44E94F02A6B525417161E240"/>
-          </w:placeholder>
-          <w:showingPlcHdr/>
-          <w:text/>
-        </w:sdtPr>
-        <w:sdtEndPr/>
-        <w:sdtContent>
-          <w:r>
-            <w:rPr>
-              <w:rStyle w:val="TextodoEspaoReservado"/>
-              <w:rFonts w:ascii="Times New Roman" w:hAnsi="Times New Roman" w:cs="Times New Roman"/>
-              <w:color w:val="C00000"/>
-            </w:rPr>
-            <w:t>endereço da empresa</w:t>
-          </w:r>
-        </w:sdtContent>
-      </w:sdt>
       <w:r>
         <w:rPr>
           <w:rFonts w:ascii="Times New Roman" w:eastAsia="Times New Roman" w:hAnsi="Times New Roman" w:cs="Times New Roman"/>
@@ -237,34 +177,6 @@
         </w:rPr>
         <w:t xml:space="preserve"> {{CNPJ}}</w:t>
       </w:r>
-      <w:sdt>
-        <w:sdtPr>
-          <w:rPr>
-            <w:rFonts w:ascii="Times New Roman" w:eastAsia="Times New Roman" w:hAnsi="Times New Roman" w:cs="Times New Roman"/>
-            <w:b/>
-            <w:bCs/>
-            <w:color w:val="000000" w:themeColor="text1"/>
-            <w:shd w:val="clear" w:color="auto" w:fill="FFFFFF"/>
-          </w:rPr>
-          <w:id w:val="951823079"/>
-          <w:placeholder>
-            <w:docPart w:val="9AB8D5C014104DAAA9365417E362FB57"/>
-          </w:placeholder>
-          <w:showingPlcHdr/>
-          <w:text/>
-        </w:sdtPr>
-        <w:sdtEndPr/>
-        <w:sdtContent>
-          <w:r>
-            <w:rPr>
-              <w:rStyle w:val="TextodoEspaoReservado"/>
-              <w:rFonts w:ascii="Times New Roman" w:hAnsi="Times New Roman" w:cs="Times New Roman"/>
-              <w:color w:val="C00000"/>
-            </w:rPr>
-            <w:t>número do CNPJ</w:t>
-          </w:r>
-        </w:sdtContent>
-      </w:sdt>
       <w:r>
         <w:rPr>
           <w:rFonts w:ascii="Times New Roman" w:eastAsia="Times New Roman" w:hAnsi="Times New Roman" w:cs="Times New Roman"/>
@@ -284,33 +196,6 @@
         </w:rPr>
         <w:t xml:space="preserve"> {{NOME_REPRESENTANTE}}</w:t>
       </w:r>
-      <w:sdt>
-        <w:sdtPr>
-          <w:rPr>
-            <w:rFonts w:ascii="Times New Roman" w:eastAsia="Times New Roman" w:hAnsi="Times New Roman" w:cs="Times New Roman"/>
-            <w:b/>
-            <w:bCs/>
-            <w:color w:val="000000" w:themeColor="text1"/>
-            <w:shd w:val="clear" w:color="auto" w:fill="FFFFFF"/>
-          </w:rPr>
-          <w:id w:val="-1324728946"/>
-          <w:placeholder>
-            <w:docPart w:val="64668E1F3C2A46BEB46D8498CCA03453"/>
-          </w:placeholder>
-          <w:showingPlcHdr/>
-        </w:sdtPr>
-        <w:sdtEndPr/>
-        <w:sdtContent>
-          <w:r>
-            <w:rPr>
-              <w:rStyle w:val="TextodoEspaoReservado"/>
-              <w:rFonts w:ascii="Times New Roman" w:hAnsi="Times New Roman" w:cs="Times New Roman"/>
-              <w:color w:val="C00000"/>
-            </w:rPr>
-            <w:t>nome do(a) sócio(a) responsável na RFB</w:t>
-          </w:r>
-        </w:sdtContent>
-      </w:sdt>
       <w:r>
         <w:rPr>
           <w:rFonts w:ascii="Times New Roman" w:eastAsia="Times New Roman" w:hAnsi="Times New Roman" w:cs="Times New Roman"/>
@@ -320,33 +205,6 @@
         </w:rPr>
         <w:t>, {{ESTADO_CIVIL}}</w:t>
       </w:r>
-      <w:sdt>
-        <w:sdtPr>
-          <w:rPr>
-            <w:rFonts w:ascii="Times New Roman" w:eastAsia="Times New Roman" w:hAnsi="Times New Roman" w:cs="Times New Roman"/>
-            <w:color w:val="000000" w:themeColor="text1"/>
-            <w:kern w:val="36"/>
-            <w:lang w:eastAsia="pt-BR"/>
-          </w:rPr>
-          <w:id w:val="-1099567228"/>
-          <w:placeholder>
-            <w:docPart w:val="9A787E4EDFC24B5D9F1AD57F51346549"/>
-          </w:placeholder>
-          <w:showingPlcHdr/>
-          <w:text/>
-        </w:sdtPr>
-        <w:sdtEndPr/>
-        <w:sdtContent>
-          <w:r>
-            <w:rPr>
-              <w:rStyle w:val="TextodoEspaoReservado"/>
-              <w:rFonts w:ascii="Times New Roman" w:hAnsi="Times New Roman" w:cs="Times New Roman"/>
-              <w:color w:val="C00000"/>
-            </w:rPr>
-            <w:t>nacionalidade</w:t>
-          </w:r>
-        </w:sdtContent>
-      </w:sdt>
       <w:r>
         <w:rPr>
           <w:rFonts w:ascii="Times New Roman" w:eastAsia="Times New Roman" w:hAnsi="Times New Roman" w:cs="Times New Roman"/>
@@ -356,32 +214,6 @@
         </w:rPr>
         <w:t>, {{PROFISSAO}}</w:t>
       </w:r>
-      <w:sdt>
-        <w:sdtPr>
-          <w:rPr>
-            <w:rFonts w:ascii="Times New Roman" w:eastAsia="Times New Roman" w:hAnsi="Times New Roman" w:cs="Times New Roman"/>
-            <w:color w:val="000000" w:themeColor="text1"/>
-            <w:kern w:val="36"/>
-            <w:lang w:eastAsia="pt-BR"/>
-          </w:rPr>
-          <w:id w:val="411741576"/>
-          <w:placeholder>
-            <w:docPart w:val="3BB6707AD14C49F0BCE379AC9357626D"/>
-          </w:placeholder>
-          <w:showingPlcHdr/>
-        </w:sdtPr>
-        <w:sdtEndPr/>
-        <w:sdtContent>
-          <w:r>
-            <w:rPr>
-              <w:rStyle w:val="TextodoEspaoReservado"/>
-              <w:rFonts w:ascii="Times New Roman" w:hAnsi="Times New Roman" w:cs="Times New Roman"/>
-              <w:color w:val="C00000"/>
-            </w:rPr>
-            <w:t>estado civil</w:t>
-          </w:r>
-        </w:sdtContent>
-      </w:sdt>
       <w:r>
         <w:rPr>
           <w:rFonts w:ascii="Times New Roman" w:eastAsia="Times New Roman" w:hAnsi="Times New Roman" w:cs="Times New Roman"/>
@@ -391,32 +223,6 @@
         </w:rPr>
         <w:t>, {{RG_REPRESENTANTE}}</w:t>
       </w:r>
-      <w:sdt>
-        <w:sdtPr>
-          <w:rPr>
-            <w:rFonts w:ascii="Times New Roman" w:eastAsia="Times New Roman" w:hAnsi="Times New Roman" w:cs="Times New Roman"/>
-            <w:color w:val="000000" w:themeColor="text1"/>
-            <w:kern w:val="36"/>
-            <w:lang w:eastAsia="pt-BR"/>
-          </w:rPr>
-          <w:id w:val="-1452930832"/>
-          <w:placeholder>
-            <w:docPart w:val="E03B341B6FCB492CB37B39BF8A32FC34"/>
-          </w:placeholder>
-          <w:showingPlcHdr/>
-        </w:sdtPr>
-        <w:sdtEndPr/>
-        <w:sdtContent>
-          <w:r>
-            <w:rPr>
-              <w:rStyle w:val="TextodoEspaoReservado"/>
-              <w:rFonts w:ascii="Times New Roman" w:hAnsi="Times New Roman" w:cs="Times New Roman"/>
-              <w:color w:val="C00000"/>
-            </w:rPr>
-            <w:t>profissão</w:t>
-          </w:r>
-        </w:sdtContent>
-      </w:sdt>
       <w:r>
         <w:rPr>
           <w:rFonts w:ascii="Times New Roman" w:eastAsia="Times New Roman" w:hAnsi="Times New Roman" w:cs="Times New Roman"/>
@@ -435,32 +241,6 @@
         </w:rPr>
         <w:t xml:space="preserve"> </w:t>
       </w:r>
-      <w:sdt>
-        <w:sdtPr>
-          <w:rPr>
-            <w:rFonts w:ascii="Times New Roman" w:eastAsia="Times New Roman" w:hAnsi="Times New Roman" w:cs="Times New Roman"/>
-            <w:color w:val="000000" w:themeColor="text1"/>
-            <w:kern w:val="36"/>
-            <w:lang w:eastAsia="pt-BR"/>
-          </w:rPr>
-          <w:id w:val="-787583537"/>
-          <w:placeholder>
-            <w:docPart w:val="BB40291391664692A93BE37FE3DFBC85"/>
-          </w:placeholder>
-          <w:showingPlcHdr/>
-        </w:sdtPr>
-        <w:sdtEndPr/>
-        <w:sdtContent>
-          <w:r>
-            <w:rPr>
-              <w:rStyle w:val="TextodoEspaoReservado"/>
-              <w:rFonts w:ascii="Times New Roman" w:hAnsi="Times New Roman" w:cs="Times New Roman"/>
-              <w:color w:val="C00000"/>
-            </w:rPr>
-            <w:t>endereço residencial do responsável</w:t>
-          </w:r>
-        </w:sdtContent>
-      </w:sdt>
       <w:r>
         <w:rPr>
           <w:rFonts w:ascii="Times New Roman" w:eastAsia="Times New Roman" w:hAnsi="Times New Roman" w:cs="Times New Roman"/>
@@ -508,32 +288,6 @@
         </w:rPr>
         <w:t xml:space="preserve"> {{CPF_REPRESENTANTE}}</w:t>
       </w:r>
-      <w:sdt>
-        <w:sdtPr>
-          <w:rPr>
-            <w:rFonts w:ascii="Times New Roman" w:eastAsia="Times New Roman" w:hAnsi="Times New Roman" w:cs="Times New Roman"/>
-            <w:b/>
-            <w:bCs/>
-            <w:color w:val="000000" w:themeColor="text1"/>
-          </w:rPr>
-          <w:id w:val="141931141"/>
-          <w:placeholder>
-            <w:docPart w:val="CA5B37BA190243DC963A9D59EC996BBC"/>
-          </w:placeholder>
-          <w:showingPlcHdr/>
-        </w:sdtPr>
-        <w:sdtEndPr/>
-        <w:sdtContent>
-          <w:r>
-            <w:rPr>
-              <w:rStyle w:val="TextodoEspaoReservado"/>
-              <w:rFonts w:ascii="Times New Roman" w:hAnsi="Times New Roman" w:cs="Times New Roman"/>
-              <w:color w:val="C00000"/>
-            </w:rPr>
-            <w:t>número do CPF</w:t>
-          </w:r>
-        </w:sdtContent>
-      </w:sdt>
       <w:r>
         <w:rPr>
           <w:rFonts w:ascii="Times New Roman" w:eastAsia="Times New Roman" w:hAnsi="Times New Roman" w:cs="Times New Roman"/>
@@ -845,29 +599,6 @@
         </w:rPr>
         <w:t xml:space="preserve"> {{PODERES}}</w:t>
       </w:r>
-      <w:sdt>
-        <w:sdtPr>
-          <w:rPr>
-            <w:rFonts w:ascii="Times New Roman" w:eastAsia="Times New Roman" w:hAnsi="Times New Roman" w:cs="Times New Roman"/>
-          </w:rPr>
-          <w:id w:val="579719936"/>
-          <w:placeholder>
-            <w:docPart w:val="663EECEA6FFC4B55B9A2095361D3E669"/>
-          </w:placeholder>
-          <w:showingPlcHdr/>
-        </w:sdtPr>
-        <w:sdtEndPr/>
-        <w:sdtContent>
-          <w:r>
-            <w:rPr>
-              <w:rStyle w:val="TextodoEspaoReservado"/>
-              <w:rFonts w:ascii="Times New Roman" w:hAnsi="Times New Roman" w:cs="Times New Roman"/>
-              <w:color w:val="C00000"/>
-            </w:rPr>
-            <w:t>DESCREVER O NOME DO ÓRGÃO E O SERVIÇO A SER REALIZADO.</w:t>
-          </w:r>
-        </w:sdtContent>
-      </w:sdt>
       <w:r>
         <w:rPr>
           <w:rFonts w:ascii="Times New Roman" w:eastAsia="Times New Roman" w:hAnsi="Times New Roman" w:cs="Times New Roman"/>
@@ -921,31 +652,6 @@
         </w:rPr>
         <w:t>Este instrumento será válido por {{VIGENCIA}}</w:t>
       </w:r>
-      <w:sdt>
-        <w:sdtPr>
-          <w:rPr>
-            <w:rFonts w:ascii="Times New Roman" w:eastAsia="Times New Roman" w:hAnsi="Times New Roman" w:cs="Times New Roman"/>
-            <w:color w:val="000000" w:themeColor="text1"/>
-            <w:lang w:eastAsia="pt-BR"/>
-          </w:rPr>
-          <w:id w:val="208624727"/>
-          <w:placeholder>
-            <w:docPart w:val="282C86CF3E734102A428F7DAEC59BA4B"/>
-          </w:placeholder>
-          <w:showingPlcHdr/>
-        </w:sdtPr>
-        <w:sdtEndPr/>
-        <w:sdtContent>
-          <w:r>
-            <w:rPr>
-              <w:rStyle w:val="TextodoEspaoReservado"/>
-              <w:rFonts w:ascii="Times New Roman" w:hAnsi="Times New Roman" w:cs="Times New Roman"/>
-              <w:color w:val="C00000"/>
-            </w:rPr>
-            <w:t>indicar a quantidade de dias</w:t>
-          </w:r>
-        </w:sdtContent>
-      </w:sdt>
       <w:r>
         <w:rPr>
           <w:rFonts w:ascii="Times New Roman" w:eastAsia="Times New Roman" w:hAnsi="Times New Roman" w:cs="Times New Roman"/>
@@ -1018,64 +724,22 @@
           <w:lang w:eastAsia="pt-BR"/>
         </w:rPr>
       </w:pPr>
-      <w:sdt>
-        <w:sdtPr>
-          <w:rPr>
-            <w:rFonts w:ascii="Times New Roman" w:eastAsia="Times New Roman" w:hAnsi="Times New Roman" w:cs="Times New Roman"/>
-            <w:color w:val="000000" w:themeColor="text1"/>
-            <w:lang w:eastAsia="pt-BR"/>
-          </w:rPr>
-          <w:id w:val="-1786570808"/>
-          <w:placeholder>
-            <w:docPart w:val="703C23771AAF48AC9D0E31EC930B1E59"/>
-          </w:placeholder>
-          <w:showingPlcHdr/>
-        </w:sdtPr>
-        <w:sdtEndPr/>
-        <w:sdtContent>
-          <w:r>
-            <w:rPr>
-              <w:rStyle w:val="TextodoEspaoReservado"/>
-              <w:rFonts w:ascii="Times New Roman" w:hAnsi="Times New Roman" w:cs="Times New Roman"/>
-              <w:color w:val="C00000"/>
-            </w:rPr>
-            <w:t>Município/UF</w:t>
-          </w:r>
-        </w:sdtContent>
-      </w:sdt>
-      <w:r>
-        <w:rPr>
-          <w:rFonts w:ascii="Times New Roman" w:eastAsia="Times New Roman" w:hAnsi="Times New Roman" w:cs="Times New Roman"/>
-          <w:color w:val="000000" w:themeColor="text1"/>
-          <w:lang w:eastAsia="pt-BR"/>
-        </w:rPr>
-        <w:t>Goiânia, {{DATA_EXTENSO}}</w:t>
-      </w:r>
-      <w:sdt>
-        <w:sdtPr>
-          <w:rPr>
-            <w:rFonts w:ascii="Times New Roman" w:eastAsia="Times New Roman" w:hAnsi="Times New Roman" w:cs="Times New Roman"/>
-            <w:color w:val="000000" w:themeColor="text1"/>
-            <w:lang w:eastAsia="pt-BR"/>
-          </w:rPr>
-          <w:id w:val="-1824196597"/>
-          <w:placeholder>
-            <w:docPart w:val="D4A5D66BEB894D458356A4560A6DF8F1"/>
-          </w:placeholder>
-          <w:showingPlcHdr/>
-        </w:sdtPr>
-        <w:sdtEndPr/>
-        <w:sdtContent>
-          <w:r>
-            <w:rPr>
-              <w:rStyle w:val="TextodoEspaoReservado"/>
-              <w:rFonts w:ascii="Times New Roman" w:hAnsi="Times New Roman" w:cs="Times New Roman"/>
-              <w:color w:val="C00000"/>
-            </w:rPr>
-            <w:t>dia/mês/ano</w:t>
-          </w:r>
-        </w:sdtContent>
-      </w:sdt>
+      <w:r>
+        <w:rPr>
+          <w:rFonts w:ascii="Times New Roman" w:hAnsi="Times New Roman" w:cs="Times New Roman"/>
+          <w:sz w:val="20"/>
+          <w:szCs w:val="20"/>
+        </w:rPr>
+        <w:t xml:space="preserve">{{MUNICIPIO_UF}}</w:t>
+      </w:r>
+      <w:r>
+        <w:rPr>
+          <w:rFonts w:ascii="Times New Roman" w:eastAsia="Times New Roman" w:hAnsi="Times New Roman" w:cs="Times New Roman"/>
+          <w:color w:val="000000" w:themeColor="text1"/>
+          <w:lang w:eastAsia="pt-BR"/>
+        </w:rPr>
+        <w:t>, {{DATA_EXTENSO}}</w:t>
+      </w:r>
       <w:r>
         <w:rPr>
           <w:rFonts w:ascii="Times New Roman" w:eastAsia="Times New Roman" w:hAnsi="Times New Roman" w:cs="Times New Roman"/>

</xml_diff>